<commit_message>
Implement complete UART-based warning system
</commit_message>
<xml_diff>
--- a/subsystems/workforce-management/docs/Safety.docx
+++ b/subsystems/workforce-management/docs/Safety.docx
@@ -22,7 +22,7 @@
       <w:pPr>
         <w:jc w:val="center"/>
         <w:rPr>
-          <w:rFonts w:cs="B Nazanin" w:hint="cs"/>
+          <w:rFonts w:cs="B Nazanin"/>
           <w:rtl/>
           <w:lang w:bidi="fa-IR"/>
         </w:rPr>
@@ -198,15 +198,7 @@
           <w:rtl/>
           <w:lang w:bidi="fa-IR"/>
         </w:rPr>
-        <w:t>افزایش حقوق بر اساس حجم کاری</w:t>
-      </w:r>
-      <w:r>
-        <w:rPr>
-          <w:rFonts w:cs="B Nazanin" w:hint="cs"/>
-          <w:rtl/>
-          <w:lang w:bidi="fa-IR"/>
-        </w:rPr>
-        <w:t>(مشترک بین بخش امنیت و اطلاعات کارگران):</w:t>
+        <w:t>افزایش حقوق بر اساس حجم کاری(مشترک بین بخش امنیت و اطلاعات کارگران):</w:t>
       </w:r>
       <w:r>
         <w:rPr>
@@ -240,10 +232,75 @@
         <w:bidi/>
         <w:ind w:left="360"/>
         <w:rPr>
+          <w:rFonts w:cs="B Nazanin"/>
+          <w:lang w:bidi="fa-IR"/>
+        </w:rPr>
+      </w:pPr>
+      <w:r>
+        <w:rPr>
           <w:rFonts w:cs="B Nazanin" w:hint="cs"/>
           <w:rtl/>
           <w:lang w:bidi="fa-IR"/>
         </w:rPr>
+        <w:t>ساخت ساختار کلی پروژه</w:t>
+      </w:r>
+    </w:p>
+    <w:p>
+      <w:pPr>
+        <w:ind w:left="360"/>
+        <w:rPr>
+          <w:rFonts w:cs="B Nazanin"/>
+          <w:lang w:bidi="fa-IR"/>
+        </w:rPr>
+      </w:pPr>
+      <w:r>
+        <w:rPr>
+          <w:rFonts w:cs="B Nazanin"/>
+          <w:lang w:bidi="fa-IR"/>
+        </w:rPr>
+        <w:t>1405/3/21</w:t>
+      </w:r>
+    </w:p>
+    <w:p>
+      <w:pPr>
+        <w:ind w:left="360"/>
+        <w:jc w:val="center"/>
+        <w:rPr>
+          <w:rFonts w:cs="B Nazanin"/>
+          <w:rtl/>
+          <w:lang w:bidi="fa-IR"/>
+        </w:rPr>
+      </w:pPr>
+      <w:r>
+        <w:rPr>
+          <w:rFonts w:cs="B Nazanin"/>
+          <w:lang w:bidi="fa-IR"/>
+        </w:rPr>
+        <w:t>21</w:t>
+      </w:r>
+      <w:r>
+        <w:rPr>
+          <w:rFonts w:cs="B Nazanin"/>
+          <w:lang w:bidi="fa-IR"/>
+        </w:rPr>
+        <w:t>:</w:t>
+      </w:r>
+      <w:r>
+        <w:rPr>
+          <w:rFonts w:cs="B Nazanin"/>
+          <w:lang w:bidi="fa-IR"/>
+        </w:rPr>
+        <w:t>55</w:t>
+      </w:r>
+    </w:p>
+    <w:p>
+      <w:pPr>
+        <w:bidi/>
+        <w:ind w:left="360"/>
+        <w:rPr>
+          <w:rFonts w:cs="B Nazanin"/>
+          <w:lang w:bidi="fa-IR"/>
+        </w:rPr>
       </w:pPr>
       <w:r>
         <w:rPr>
@@ -251,7 +308,42 @@
           <w:rtl/>
           <w:lang w:bidi="fa-IR"/>
         </w:rPr>
-        <w:t>ساخت ساختار کلی پروژه</w:t>
+        <w:t>به دلیل تغییر نام گذاری و ساختار پوشه ها کامیت</w:t>
+      </w:r>
+      <w:r>
+        <w:rPr>
+          <w:rFonts w:cs="B Nazanin" w:hint="cs"/>
+          <w:rtl/>
+          <w:lang w:bidi="fa-IR"/>
+        </w:rPr>
+        <w:t xml:space="preserve"> هجدهم خرداد</w:t>
+      </w:r>
+      <w:r>
+        <w:rPr>
+          <w:rFonts w:cs="B Nazanin" w:hint="cs"/>
+          <w:rtl/>
+          <w:lang w:bidi="fa-IR"/>
+        </w:rPr>
+        <w:t xml:space="preserve"> با همان نام دوباره کامیت شد</w:t>
+      </w:r>
+    </w:p>
+    <w:p>
+      <w:pPr>
+        <w:bidi/>
+        <w:ind w:left="360"/>
+        <w:rPr>
+          <w:rFonts w:cs="B Nazanin"/>
+          <w:rtl/>
+          <w:lang w:bidi="fa-IR"/>
+        </w:rPr>
+      </w:pPr>
+      <w:r>
+        <w:rPr>
+          <w:rFonts w:cs="B Nazanin" w:hint="cs"/>
+          <w:rtl/>
+          <w:lang w:bidi="fa-IR"/>
+        </w:rPr>
+        <w:t>پیاده سازی و تکمیل کردن سیستم هشدار امنیتی</w:t>
       </w:r>
     </w:p>
     <w:sectPr>

</xml_diff>

<commit_message>
Feat(warning): replace single-character signals with text-based warning messages
</commit_message>
<xml_diff>
--- a/subsystems/workforce-management/docs/Safety.docx
+++ b/subsystems/workforce-management/docs/Safety.docx
@@ -263,34 +263,36 @@
     </w:p>
     <w:p>
       <w:pPr>
+        <w:bidi/>
         <w:ind w:left="360"/>
-        <w:jc w:val="center"/>
-        <w:rPr>
-          <w:rFonts w:cs="B Nazanin"/>
-          <w:rtl/>
-          <w:lang w:bidi="fa-IR"/>
-        </w:rPr>
-      </w:pPr>
-      <w:r>
-        <w:rPr>
-          <w:rFonts w:cs="B Nazanin"/>
-          <w:lang w:bidi="fa-IR"/>
-        </w:rPr>
-        <w:t>21</w:t>
-      </w:r>
-      <w:r>
-        <w:rPr>
-          <w:rFonts w:cs="B Nazanin"/>
-          <w:lang w:bidi="fa-IR"/>
-        </w:rPr>
-        <w:t>:</w:t>
-      </w:r>
-      <w:r>
-        <w:rPr>
-          <w:rFonts w:cs="B Nazanin"/>
-          <w:lang w:bidi="fa-IR"/>
-        </w:rPr>
-        <w:t>55</w:t>
+        <w:rPr>
+          <w:rFonts w:cs="B Nazanin"/>
+          <w:lang w:bidi="fa-IR"/>
+        </w:rPr>
+      </w:pPr>
+      <w:r>
+        <w:rPr>
+          <w:rFonts w:cs="B Nazanin" w:hint="cs"/>
+          <w:rtl/>
+          <w:lang w:bidi="fa-IR"/>
+        </w:rPr>
+        <w:t>به دلیل تغییر نام گذاری و ساختار پوشه ها کامیت</w:t>
+      </w:r>
+      <w:r>
+        <w:rPr>
+          <w:rFonts w:cs="B Nazanin" w:hint="cs"/>
+          <w:rtl/>
+          <w:lang w:bidi="fa-IR"/>
+        </w:rPr>
+        <w:t xml:space="preserve"> هجدهم خرداد</w:t>
+      </w:r>
+      <w:r>
+        <w:rPr>
+          <w:rFonts w:cs="B Nazanin" w:hint="cs"/>
+          <w:rtl/>
+          <w:lang w:bidi="fa-IR"/>
+        </w:rPr>
+        <w:t xml:space="preserve"> با همان نام دوباره کامیت شد</w:t>
       </w:r>
     </w:p>
     <w:p>
@@ -308,27 +310,27 @@
           <w:rtl/>
           <w:lang w:bidi="fa-IR"/>
         </w:rPr>
-        <w:t>به دلیل تغییر نام گذاری و ساختار پوشه ها کامیت</w:t>
-      </w:r>
-      <w:r>
-        <w:rPr>
-          <w:rFonts w:cs="B Nazanin" w:hint="cs"/>
-          <w:rtl/>
-          <w:lang w:bidi="fa-IR"/>
-        </w:rPr>
-        <w:t xml:space="preserve"> هجدهم خرداد</w:t>
-      </w:r>
-      <w:r>
-        <w:rPr>
-          <w:rFonts w:cs="B Nazanin" w:hint="cs"/>
-          <w:rtl/>
-          <w:lang w:bidi="fa-IR"/>
-        </w:rPr>
-        <w:t xml:space="preserve"> با همان نام دوباره کامیت شد</w:t>
+        <w:t>پیاده سازی و تکمیل کردن سیستم هشدار امنیتی</w:t>
       </w:r>
     </w:p>
     <w:p>
       <w:pPr>
+        <w:ind w:left="360"/>
+        <w:rPr>
+          <w:rFonts w:cs="B Nazanin"/>
+          <w:lang w:bidi="fa-IR"/>
+        </w:rPr>
+      </w:pPr>
+      <w:r>
+        <w:rPr>
+          <w:rFonts w:cs="B Nazanin"/>
+          <w:lang w:bidi="fa-IR"/>
+        </w:rPr>
+        <w:t>1405/3/29</w:t>
+      </w:r>
+    </w:p>
+    <w:p>
+      <w:pPr>
         <w:bidi/>
         <w:ind w:left="360"/>
         <w:rPr>
@@ -343,7 +345,22 @@
           <w:rtl/>
           <w:lang w:bidi="fa-IR"/>
         </w:rPr>
-        <w:t>پیاده سازی و تکمیل کردن سیستم هشدار امنیتی</w:t>
+        <w:t>ارتقا دادن بخش</w:t>
+      </w:r>
+      <w:r>
+        <w:rPr>
+          <w:rFonts w:cs="B Nazanin"/>
+          <w:lang w:bidi="fa-IR"/>
+        </w:rPr>
+        <w:t xml:space="preserve">UART </w:t>
+      </w:r>
+      <w:r>
+        <w:rPr>
+          <w:rFonts w:cs="B Nazanin" w:hint="cs"/>
+          <w:rtl/>
+          <w:lang w:bidi="fa-IR"/>
+        </w:rPr>
+        <w:t xml:space="preserve"> از کار کردن با تک حرف به کار کردن با عبارت و چاپ عبارت هشداری به عنوان خروجی به جای برگرداندن تک حرف ورودی</w:t>
       </w:r>
     </w:p>
     <w:sectPr>

</xml_diff>

<commit_message>
Feat(dispatch): implement task assignment relay from central controller
</commit_message>
<xml_diff>
--- a/subsystems/workforce-management/docs/Safety.docx
+++ b/subsystems/workforce-management/docs/Safety.docx
@@ -361,6 +361,42 @@
           <w:lang w:bidi="fa-IR"/>
         </w:rPr>
         <w:t xml:space="preserve"> از کار کردن با تک حرف به کار کردن با عبارت و چاپ عبارت هشداری به عنوان خروجی به جای برگرداندن تک حرف ورودی</w:t>
+      </w:r>
+    </w:p>
+    <w:p>
+      <w:pPr>
+        <w:ind w:left="360"/>
+        <w:rPr>
+          <w:rFonts w:cs="B Nazanin"/>
+          <w:rtl/>
+          <w:lang w:bidi="fa-IR"/>
+        </w:rPr>
+      </w:pPr>
+      <w:r>
+        <w:rPr>
+          <w:rFonts w:cs="B Nazanin"/>
+          <w:lang w:bidi="fa-IR"/>
+        </w:rPr>
+        <w:t>1405/3/30</w:t>
+      </w:r>
+    </w:p>
+    <w:p>
+      <w:pPr>
+        <w:bidi/>
+        <w:ind w:left="360"/>
+        <w:rPr>
+          <w:rFonts w:cs="B Nazanin" w:hint="cs"/>
+          <w:rtl/>
+          <w:lang w:bidi="fa-IR"/>
+        </w:rPr>
+      </w:pPr>
+      <w:r>
+        <w:rPr>
+          <w:rFonts w:cs="B Nazanin" w:hint="cs"/>
+          <w:rtl/>
+          <w:lang w:bidi="fa-IR"/>
+        </w:rPr>
+        <w:t>ایجاد بخش انتقال پیام حجم کار از سیستم مرکزی به کارگر</w:t>
       </w:r>
     </w:p>
     <w:sectPr>

</xml_diff>